<commit_message>
feat(graph_inspection): create graph_inspection/ with graph_draw, subway_maps, and new graph_report
- Create graph_inspection/ and move graph_draw/ and subway_maps/ into it,
  removing them from routing_algorithms/ and the repo root respectively
- Add graph_report.py: summarises the weighted subway graph (WEIGHTS_FILE)
  by vertex/edge/arrow counts split by type (SW/TF/PW) and by whether each
  stop is a duplication artifact from the shared-platform split
- Rename data/5_shared_platforms/equivalences_shared.txt to equivalences.txt
  and update all references in gtfs_utils.py and the pipeline scripts
- Update .gitignore, README.md, routing_algorithms/README.md, and
  data_validation READMEs to reflect the new folder structure
</commit_message>
<xml_diff>
--- a/.docu/Algoritmes per trobar una ruta òptima/Dijkstra.docx
+++ b/.docu/Algoritmes per trobar una ruta òptima/Dijkstra.docx
@@ -658,14 +658,7 @@
           <w:rFonts w:ascii="Arial" w:hAnsi="Arial" w:cs="Arial"/>
           <w:lang w:val="ca-ES"/>
         </w:rPr>
-        <w:t xml:space="preserve"> </w:t>
-      </w:r>
-      <w:r>
-        <w:rPr>
-          <w:rFonts w:ascii="Arial" w:hAnsi="Arial" w:cs="Arial"/>
-          <w:lang w:val="ca-ES"/>
-        </w:rPr>
-        <w:t xml:space="preserve">Explicació fórmules parent i </w:t>
+        <w:t xml:space="preserve"> Explicació fórmules parent i </w:t>
       </w:r>
       <w:proofErr w:type="spellStart"/>
       <w:r>
@@ -1132,7 +1125,67 @@
           <w:rFonts w:ascii="Arial" w:hAnsi="Arial" w:cs="Arial"/>
           <w:lang w:val="ca-ES"/>
         </w:rPr>
-        <w:t>Basat en la diapositiva 29 (pàgina 37), fet 2:</w:t>
+        <w:t>Basat en la diapositiva 29 (</w:t>
+      </w:r>
+      <w:proofErr w:type="spellStart"/>
+      <w:r>
+        <w:rPr>
+          <w:rFonts w:ascii="Arial" w:hAnsi="Arial" w:cs="Arial"/>
+          <w:lang w:val="ca-ES"/>
+        </w:rPr>
+        <w:t>diapo</w:t>
+      </w:r>
+      <w:proofErr w:type="spellEnd"/>
+      <w:r>
+        <w:rPr>
+          <w:rFonts w:ascii="Arial" w:hAnsi="Arial" w:cs="Arial"/>
+          <w:lang w:val="ca-ES"/>
+        </w:rPr>
+        <w:t xml:space="preserve"> </w:t>
+      </w:r>
+      <w:r>
+        <w:rPr>
+          <w:rFonts w:ascii="Arial" w:hAnsi="Arial" w:cs="Arial"/>
+          <w:lang w:val="ca-ES"/>
+        </w:rPr>
+        <w:t>29</w:t>
+      </w:r>
+      <w:r>
+        <w:rPr>
+          <w:rFonts w:ascii="Arial" w:hAnsi="Arial" w:cs="Arial"/>
+          <w:lang w:val="ca-ES"/>
+        </w:rPr>
+        <w:t>), fet 2</w:t>
+      </w:r>
+      <w:r>
+        <w:rPr>
+          <w:rFonts w:ascii="Arial" w:hAnsi="Arial" w:cs="Arial"/>
+          <w:lang w:val="ca-ES"/>
+        </w:rPr>
+        <w:t xml:space="preserve"> i segon paràgraf de la introducció (</w:t>
+      </w:r>
+      <w:proofErr w:type="spellStart"/>
+      <w:r>
+        <w:rPr>
+          <w:rFonts w:ascii="Arial" w:hAnsi="Arial" w:cs="Arial"/>
+          <w:lang w:val="ca-ES"/>
+        </w:rPr>
+        <w:t>diapo</w:t>
+      </w:r>
+      <w:proofErr w:type="spellEnd"/>
+      <w:r>
+        <w:rPr>
+          <w:rFonts w:ascii="Arial" w:hAnsi="Arial" w:cs="Arial"/>
+          <w:lang w:val="ca-ES"/>
+        </w:rPr>
+        <w:t xml:space="preserve"> 17)</w:t>
+      </w:r>
+      <w:r>
+        <w:rPr>
+          <w:rFonts w:ascii="Arial" w:hAnsi="Arial" w:cs="Arial"/>
+          <w:lang w:val="ca-ES"/>
+        </w:rPr>
+        <w:t>:</w:t>
       </w:r>
     </w:p>
     <w:p>
@@ -1540,6 +1593,58 @@
           <w:lang w:val="ca-ES"/>
         </w:rPr>
         <w:t>.</w:t>
+      </w:r>
+    </w:p>
+    <w:p>
+      <w:pPr>
+        <w:ind w:firstLine="720"/>
+        <w:rPr>
+          <w:rFonts w:ascii="Arial" w:hAnsi="Arial" w:cs="Arial"/>
+        </w:rPr>
+      </w:pPr>
+      <w:r>
+        <w:rPr>
+          <w:rFonts w:ascii="Arial" w:hAnsi="Arial" w:cs="Arial"/>
+          <w:lang w:val="ca-ES"/>
+        </w:rPr>
+        <w:sym w:font="Wingdings" w:char="F0E0"/>
+      </w:r>
+      <w:r>
+        <w:rPr>
+          <w:rFonts w:ascii="Arial" w:hAnsi="Arial" w:cs="Arial"/>
+          <w:lang w:val="ca-ES"/>
+        </w:rPr>
+        <w:t xml:space="preserve"> </w:t>
+      </w:r>
+      <w:r>
+        <w:rPr>
+          <w:rFonts w:ascii="Arial" w:hAnsi="Arial" w:cs="Arial"/>
+        </w:rPr>
+        <w:t>It can also solve the routing problem by stopping the algorithm</w:t>
+      </w:r>
+      <w:r>
+        <w:rPr>
+          <w:rFonts w:ascii="Arial" w:hAnsi="Arial" w:cs="Arial"/>
+        </w:rPr>
+        <w:t xml:space="preserve"> </w:t>
+      </w:r>
+      <w:r>
+        <w:rPr>
+          <w:rFonts w:ascii="Arial" w:hAnsi="Arial" w:cs="Arial"/>
+        </w:rPr>
+        <w:t>once the shortest path to the destination node has been</w:t>
+      </w:r>
+      <w:r>
+        <w:rPr>
+          <w:rFonts w:ascii="Arial" w:hAnsi="Arial" w:cs="Arial"/>
+        </w:rPr>
+        <w:t xml:space="preserve"> </w:t>
+      </w:r>
+      <w:r>
+        <w:rPr>
+          <w:rFonts w:ascii="Arial" w:hAnsi="Arial" w:cs="Arial"/>
+        </w:rPr>
+        <w:t>determined.</w:t>
       </w:r>
     </w:p>
     <w:p>
@@ -1733,7 +1838,66 @@
     </w:p>
     <w:p>
       <w:pPr>
-        <w:ind w:firstLine="720"/>
+        <w:rPr>
+          <w:rFonts w:ascii="Arial" w:hAnsi="Arial" w:cs="Arial"/>
+          <w:lang w:val="ca-ES"/>
+        </w:rPr>
+      </w:pPr>
+      <w:r>
+        <w:rPr>
+          <w:rFonts w:ascii="Arial" w:hAnsi="Arial" w:cs="Arial"/>
+        </w:rPr>
+        <w:t xml:space="preserve">En algoritmos como </w:t>
+      </w:r>
+      <w:r>
+        <w:rPr>
+          <w:rFonts w:ascii="Arial" w:hAnsi="Arial" w:cs="Arial"/>
+          <w:i/>
+          <w:iCs/>
+        </w:rPr>
+        <w:t>Dijkstra</w:t>
+      </w:r>
+      <w:r>
+        <w:rPr>
+          <w:rFonts w:ascii="Arial" w:hAnsi="Arial" w:cs="Arial"/>
+        </w:rPr>
+        <w:t xml:space="preserve"> o </w:t>
+      </w:r>
+      <w:r>
+        <w:rPr>
+          <w:rFonts w:ascii="Arial" w:hAnsi="Arial" w:cs="Arial"/>
+          <w:i/>
+          <w:iCs/>
+        </w:rPr>
+        <w:t>Bellman-Ford</w:t>
+      </w:r>
+      <w:r>
+        <w:rPr>
+          <w:rFonts w:ascii="Arial" w:hAnsi="Arial" w:cs="Arial"/>
+        </w:rPr>
+        <w:t>, el paso de relajación (RELAX) actualiza el costo estimado para llegar a un nodo vecino. Comprueba si pasar por el nodo actual representa una ruta más corta que la encontrada anteriormente.</w:t>
+      </w:r>
+      <w:r>
+        <w:rPr>
+          <w:rFonts w:ascii="Arial" w:hAnsi="Arial" w:cs="Arial"/>
+        </w:rPr>
+        <w:t xml:space="preserve"> </w:t>
+      </w:r>
+      <w:r>
+        <w:rPr>
+          <w:rFonts w:ascii="Arial" w:hAnsi="Arial" w:cs="Arial"/>
+        </w:rPr>
+        <w:sym w:font="Wingdings" w:char="F0DF"/>
+      </w:r>
+      <w:r>
+        <w:rPr>
+          <w:rFonts w:ascii="Arial" w:hAnsi="Arial" w:cs="Arial"/>
+        </w:rPr>
+        <w:t xml:space="preserve"> SI ÉS MÉS RELAXANT ANAR PER UN ALTRE LLOC</w:t>
+      </w:r>
+    </w:p>
+    <w:p>
+      <w:pPr>
         <w:rPr>
           <w:rFonts w:ascii="Arial" w:hAnsi="Arial" w:cs="Arial"/>
           <w:lang w:val="ca-ES"/>

</xml_diff>